<commit_message>
Reestructurar el capítulo I según las guías de la clase y el FOR-INVP-009
- Documento metodológico con una sola versión (PDF y Word) en formato del
  Manual: portada del anexo C-1 con logo y posiciones fijas, índice del
  anexo C-2 con "x" en lo pendiente y el texto desde el capítulo I.
- Capítulo I solo con los títulos del Manual; niveles, causas, pronóstico,
  delimitación y formulación pasan a prosa. Cinco párrafos por nivel,
  situación deseada, citas textuales verificadas y cuadro 1.
- Justificación con las relevancias del FOR-INVP-009, sin repetir la
  contextualización; OE1 sin el lugar (también en el documento técnico).
- Propuesta corta separada (línea, modalidad y estructura).
- FOR-INVP-009 y logo en el repositorio; README, AGENTS y skills al día.

Co-Authored-By: Claude Opus 5.5 <noreply@anthropic.com>
</commit_message>
<xml_diff>
--- a/plantillas/referencia-manual.docx
+++ b/plantillas/referencia-manual.docx
@@ -1310,6 +1310,53 @@
       <w:rFonts w:ascii="Arial" w:hAnsi="Arial" w:cs="Arial"/>
       <w:color w:val="000000"/>
       <w:sz w:val="22"/>
+    </w:rPr>
+  </w:style>
+  <w:style w:type="paragraph" w:customStyle="1" w:styleId="CuadroNumero">
+    <w:name w:val="Cuadro Numero"/>
+    <w:basedOn w:val="Normal"/>
+    <w:pPr>
+      <w:keepNext/>
+      <w:pageBreakBefore w:val="0"/>
+      <w:spacing w:before="240" w:after="0" w:lineRule="auto" w:line="240"/>
+      <w:jc w:val="left"/>
+    </w:pPr>
+    <w:rPr>
+      <w:rFonts w:ascii="Arial" w:hAnsi="Arial" w:cs="Arial"/>
+      <w:b/>
+      <w:color w:val="000000"/>
+      <w:sz w:val="24"/>
+    </w:rPr>
+  </w:style>
+  <w:style w:type="paragraph" w:customStyle="1" w:styleId="CuadroTitulo">
+    <w:name w:val="Cuadro Titulo"/>
+    <w:basedOn w:val="Normal"/>
+    <w:pPr>
+      <w:keepNext/>
+      <w:pageBreakBefore w:val="0"/>
+      <w:spacing w:before="0" w:after="120" w:lineRule="auto" w:line="240"/>
+      <w:jc w:val="left"/>
+    </w:pPr>
+    <w:rPr>
+      <w:rFonts w:ascii="Arial" w:hAnsi="Arial" w:cs="Arial"/>
+      <w:b/>
+      <w:color w:val="000000"/>
+      <w:sz w:val="24"/>
+    </w:rPr>
+  </w:style>
+  <w:style w:type="paragraph" w:customStyle="1" w:styleId="NotadeCuadro">
+    <w:name w:val="Nota de Cuadro"/>
+    <w:basedOn w:val="Normal"/>
+    <w:pPr>
+      <w:keepNext w:val="0"/>
+      <w:pageBreakBefore w:val="0"/>
+      <w:spacing w:before="80" w:after="240" w:lineRule="auto" w:line="240"/>
+      <w:jc w:val="left"/>
+    </w:pPr>
+    <w:rPr>
+      <w:rFonts w:ascii="Arial" w:hAnsi="Arial" w:cs="Arial"/>
+      <w:color w:val="000000"/>
+      <w:sz w:val="20"/>
     </w:rPr>
   </w:style>
   <w:style w:type="paragraph" w:customStyle="1" w:styleId="Referencia">

</xml_diff>